<commit_message>
docs: troca travessao por pontuacao equivalente
1.908 ocorrencias em docs/, plans/, scripts/ e raiz, pela regra nova de
escrita do CLAUDE.md. Sentido preservado; so muda a pontuacao.

Criterio aplicado:
- par de travessoes no meio da frase vira parenteses
- rotulo no inicio ("Area A — Dominio") vira dois-pontos
- travessao que introduz oracao completa vira dois-pontos
- o resto vira virgula
- celula de tabela que so tinha "—" (marcador de "nenhum") vira "-"

Fora do escopo: src/, porque ali o travessao aparece em texto de interface e
em assercao de teste, e mexer nisso nao e trocar pontuacao. Blocos de codigo
tambem ficaram intactos (mockups em ASCII, SQL, listagens de schema). As
mensagens de commit anteriores nao foram reescritas: exigiria rebase.

word/ e o .docx foram regerados a partir das fontes. Word abre normal: 13
tabelas, 13 paginas. 663 testes passando.

Co-Authored-By: Claude Opus 5 <noreply@anthropic.com>
</commit_message>
<xml_diff>
--- a/quadros-regras-de-negocio-e-requisitos.docx
+++ b/quadros-regras-de-negocio-e-requisitos.docx
@@ -195,7 +195,7 @@
                 <w:sz w:val="20"/>
                 <w:szCs w:val="20"/>
               </w:rPr>
-              <w:t xml:space="preserve">Toda informação do viveiro — custo, preço, estoque, perda, pedido — refere-se a uma espécie; a espécie é a unidade em torno da qual a operação se organiza</w:t>
+              <w:t xml:space="preserve">Toda informação do viveiro (custo, preço, estoque, perda, pedido) refere-se a uma espécie; a espécie é a unidade em torno da qual a operação se organiza</w:t>
             </w:r>
           </w:p>
         </w:tc>
@@ -341,7 +341,7 @@
                 <w:sz w:val="20"/>
                 <w:szCs w:val="20"/>
               </w:rPr>
-              <w:t xml:space="preserve">Uma espécie admite várias características simultâneas — nativa, exótica, frutífera, ornamental, madeireira, forrageira. Uma nativa pode ser ao mesmo tempo frutífera e madeireira</w:t>
+              <w:t xml:space="preserve">Uma espécie admite várias características simultâneas, nativa, exótica, frutífera, ornamental, madeireira, forrageira. Uma nativa pode ser ao mesmo tempo frutífera e madeireira</w:t>
             </w:r>
           </w:p>
         </w:tc>
@@ -487,7 +487,7 @@
                 <w:sz w:val="20"/>
                 <w:szCs w:val="20"/>
               </w:rPr>
-              <w:t xml:space="preserve">O ciclo produtivo — semeadura, germinação, repicagem, rustificação — tem duração conhecida por espécie e recipiente; a data de disponibilidade decorre da data de semeadura somada a essa duração</w:t>
+              <w:t xml:space="preserve">O ciclo produtivo (semeadura, germinação, repicagem, rustificação) tem duração conhecida por espécie e recipiente; a data de disponibilidade decorre da data de semeadura somada a essa duração</w:t>
             </w:r>
           </w:p>
         </w:tc>
@@ -831,7 +831,7 @@
                 <w:sz w:val="20"/>
                 <w:szCs w:val="20"/>
               </w:rPr>
-              <w:t xml:space="preserve">O preço do insumo varia ao longo do tempo, e o custo apurado em um período permanece válido para aquele período — o valor anterior não é descartado</w:t>
+              <w:t xml:space="preserve">O preço do insumo varia ao longo do tempo, e o custo apurado em um período permanece válido para aquele período: o valor anterior não é descartado</w:t>
             </w:r>
           </w:p>
         </w:tc>
@@ -977,7 +977,7 @@
                 <w:sz w:val="20"/>
                 <w:szCs w:val="20"/>
               </w:rPr>
-              <w:t xml:space="preserve">A mão de obra compõe o custo por tempo médio estimado por atividade, e não por apontamento individual de horas — precisão suficiente para revelar margem negativa, sem impor controle de ponto por tarefa</w:t>
+              <w:t xml:space="preserve">A mão de obra compõe o custo por tempo médio estimado por atividade, e não por apontamento individual de horas, precisão suficiente para revelar margem negativa, sem impor controle de ponto por tarefa</w:t>
             </w:r>
           </w:p>
         </w:tc>
@@ -1050,7 +1050,7 @@
                 <w:sz w:val="20"/>
                 <w:szCs w:val="20"/>
               </w:rPr>
-              <w:t xml:space="preserve">A semente coletada em campo tem custo próprio — deslocamento, combustível e horas —, rateado pela quantidade obtida. Nem toda espécie tem semente comprada</w:t>
+              <w:t xml:space="preserve">A semente coletada em campo tem custo próprio (deslocamento, combustível e horas), rateado pela quantidade obtida. Nem toda espécie tem semente comprada</w:t>
             </w:r>
           </w:p>
         </w:tc>
@@ -1196,7 +1196,7 @@
                 <w:sz w:val="20"/>
                 <w:szCs w:val="20"/>
               </w:rPr>
-              <w:t xml:space="preserve">A mão de obra entra no custo por um valor-hora médio da equipe — folha do mês dividida pelas horas do mês —, e não pelo salário de cada um. O que varia entre espécies é o tempo gasto, não quem o gastou; e o custo fica real sem expor remuneração individual</w:t>
+              <w:t xml:space="preserve">A mão de obra entra no custo por um valor-hora médio da equipe (folha do mês dividida pelas horas do mês), e não pelo salário de cada um. O que varia entre espécies é o tempo gasto, não quem o gastou; e o custo fica real sem expor remuneração individual</w:t>
             </w:r>
           </w:p>
         </w:tc>
@@ -1686,7 +1686,7 @@
                 <w:sz w:val="20"/>
                 <w:szCs w:val="20"/>
               </w:rPr>
-              <w:t xml:space="preserve">A perda é evento normal da produção e exige causa classificada em lista fechada — seca, praga, geada, manuseio, outro. Campo livre inviabiliza a análise por causa</w:t>
+              <w:t xml:space="preserve">A perda é evento normal da produção e exige causa classificada em lista fechada, seca, praga, geada, manuseio, outro. Campo livre inviabiliza a análise por causa</w:t>
             </w:r>
           </w:p>
         </w:tc>
@@ -2051,7 +2051,7 @@
                 <w:sz w:val="20"/>
                 <w:szCs w:val="20"/>
               </w:rPr>
-              <w:t xml:space="preserve">A semana fecha e, fechada, não se altera — sem isso o custo do período muda depois de apurado</w:t>
+              <w:t xml:space="preserve">A semana fecha e, fechada, não se altera: sem isso o custo do período muda depois de apurado</w:t>
             </w:r>
           </w:p>
         </w:tc>
@@ -2468,7 +2468,7 @@
                 <w:sz w:val="20"/>
                 <w:szCs w:val="20"/>
               </w:rPr>
-              <w:t xml:space="preserve">O preço de venda é custo unitário real mais a margem do canal — nunca estimativa intuitiva</w:t>
+              <w:t xml:space="preserve">O preço de venda é custo unitário real mais a margem do canal, nunca estimativa intuitiva</w:t>
             </w:r>
           </w:p>
         </w:tc>
@@ -2541,7 +2541,7 @@
                 <w:sz w:val="20"/>
                 <w:szCs w:val="20"/>
               </w:rPr>
-              <w:t xml:space="preserve">O canal de venda é lista fechada de cinco — atacado (padrão), compensação ambiental, paisagismo, prefeitura, varejo — e determina a margem. O mesmo produto tem preços diferentes por canal, e isso é regra, não exceção</w:t>
+              <w:t xml:space="preserve">O canal de venda é lista fechada de cinco, atacado (padrão), compensação ambiental, paisagismo, prefeitura, varejo, e determina a margem. O mesmo produto tem preços diferentes por canal, e isso é regra, não exceção</w:t>
             </w:r>
           </w:p>
         </w:tc>
@@ -2687,7 +2687,7 @@
                 <w:sz w:val="20"/>
                 <w:szCs w:val="20"/>
               </w:rPr>
-              <w:t xml:space="preserve">O piso mínimo varia por canal e por espécie — não é constante única do sistema</w:t>
+              <w:t xml:space="preserve">O piso mínimo varia por canal e por espécie: não é constante única do sistema</w:t>
             </w:r>
           </w:p>
         </w:tc>
@@ -2833,7 +2833,7 @@
                 <w:sz w:val="20"/>
                 <w:szCs w:val="20"/>
               </w:rPr>
-              <w:t xml:space="preserve">Margem negativa é venda com prejuízo e precisa ser detectada e destacada — hoje ela ocorre sem que ninguém perceba</w:t>
+              <w:t xml:space="preserve">Margem negativa é venda com prejuízo e precisa ser detectada e destacada: hoje ela ocorre sem que ninguém perceba</w:t>
             </w:r>
           </w:p>
         </w:tc>
@@ -2906,7 +2906,7 @@
                 <w:sz w:val="20"/>
                 <w:szCs w:val="20"/>
               </w:rPr>
-              <w:t xml:space="preserve">O preço vale por um período, e a margem de uma venda se afere contra o custo vigente no dia em que ela foi feita — sobrescrever o custo apagaria a resposta para "qual era a margem quando eu vendi"</w:t>
+              <w:t xml:space="preserve">O preço vale por um período, e a margem de uma venda se afere contra o custo vigente no dia em que ela foi feita, sobrescrever o custo apagaria a resposta para "qual era a margem quando eu vendi"</w:t>
             </w:r>
           </w:p>
         </w:tc>
@@ -3323,7 +3323,7 @@
                 <w:sz w:val="20"/>
                 <w:szCs w:val="20"/>
               </w:rPr>
-              <w:t xml:space="preserve">Toda contraparte do viveiro é uma identidade única — quem compra, quem vende, quem trabalha, o sócio, o banco, o governo, o contador —, e o vínculo com o viveiro é papel acumulável dessa identidade, escolhido em lista fechada. A mesma pessoa pode ser cliente e fornecedor; a identidade é uma só, os papéis é que são múltiplos</w:t>
+              <w:t xml:space="preserve">Toda contraparte do viveiro é uma identidade única (quem compra, quem vende, quem trabalha, o sócio, o banco, o governo, o contador), e o vínculo com o viveiro é papel acumulável dessa identidade, escolhido em lista fechada. A mesma pessoa pode ser cliente e fornecedor; a identidade é uma só, os papéis é que são múltiplos</w:t>
             </w:r>
           </w:p>
         </w:tc>
@@ -3688,7 +3688,7 @@
                 <w:sz w:val="20"/>
                 <w:szCs w:val="20"/>
               </w:rPr>
-              <w:t xml:space="preserve">O tipo de tarefa é vocabulário fechado, e carrega o tempo médio por unidade — é ele que liga a atividade de campo ao custo</w:t>
+              <w:t xml:space="preserve">O tipo de tarefa é vocabulário fechado, e carrega o tempo médio por unidade, é ele que liga a atividade de campo ao custo</w:t>
             </w:r>
           </w:p>
         </w:tc>
@@ -4105,7 +4105,7 @@
                 <w:sz w:val="20"/>
                 <w:szCs w:val="20"/>
               </w:rPr>
-              <w:t xml:space="preserve">O pedido percorre uma sequência de estados até a entrega, e cada transição tem um responsável — quem conclui uma etapa aciona a seguinte</w:t>
+              <w:t xml:space="preserve">O pedido percorre uma sequência de estados até a entrega, e cada transição tem um responsável: quem conclui uma etapa aciona a seguinte</w:t>
             </w:r>
           </w:p>
         </w:tc>
@@ -4543,7 +4543,7 @@
                 <w:sz w:val="20"/>
                 <w:szCs w:val="20"/>
               </w:rPr>
-              <w:t xml:space="preserve">A carga é gerada a partir dos itens aprovados e separada fisicamente em campo; é ela, e não o pedido, a unidade que sai do viveiro. Um pedido pode gerar mais de uma carga, e a entrega da última não fecha o ciclo por si só — ver RN-63 e RN-70</w:t>
+              <w:t xml:space="preserve">A carga é gerada a partir dos itens aprovados e separada fisicamente em campo; é ela, e não o pedido, a unidade que sai do viveiro. Um pedido pode gerar mais de uma carga, e a entrega da última não fecha o ciclo por si só, ver RN-63 e RN-70</w:t>
             </w:r>
           </w:p>
         </w:tc>
@@ -4689,7 +4689,7 @@
                 <w:sz w:val="20"/>
                 <w:szCs w:val="20"/>
               </w:rPr>
-              <w:t xml:space="preserve">A revenda de muda de terceiro também respeita o piso mínimo — o custo de aquisição substitui o custo de produção, a regra do piso permanece</w:t>
+              <w:t xml:space="preserve">A revenda de muda de terceiro também respeita o piso mínimo: o custo de aquisição substitui o custo de produção, a regra do piso permanece</w:t>
             </w:r>
           </w:p>
         </w:tc>
@@ -4908,7 +4908,7 @@
                 <w:sz w:val="20"/>
                 <w:szCs w:val="20"/>
               </w:rPr>
-              <w:t xml:space="preserve">O fornecedor que não responde deixa de ser consultado — a confiabilidade se mede pela taxa de resposta, e a cotação deixa de ser disparo cego</w:t>
+              <w:t xml:space="preserve">O fornecedor que não responde deixa de ser consultado: a confiabilidade se mede pela taxa de resposta, e a cotação deixa de ser disparo cego</w:t>
             </w:r>
           </w:p>
         </w:tc>
@@ -5325,7 +5325,7 @@
                 <w:sz w:val="20"/>
                 <w:szCs w:val="20"/>
               </w:rPr>
-              <w:t xml:space="preserve">O centro de custo separa gasto de negócio de gasto pessoal da família — lista fechada de cinco: viveiro, sítio, clínica, casa, floricultura. A separação é pré-requisito de qualquer indicador confiável</w:t>
+              <w:t xml:space="preserve">O centro de custo separa gasto de negócio de gasto pessoal da família, lista fechada de cinco: viveiro, sítio, clínica, casa, floricultura. A separação é pré-requisito de qualquer indicador confiável</w:t>
             </w:r>
           </w:p>
         </w:tc>
@@ -5398,7 +5398,7 @@
                 <w:sz w:val="20"/>
                 <w:szCs w:val="20"/>
               </w:rPr>
-              <w:t xml:space="preserve">Lançamento equivalente a outro já classificado recebe a mesma classificação — o gasto recorrente não se reclassifica todo mês</w:t>
+              <w:t xml:space="preserve">Lançamento equivalente a outro já classificado recebe a mesma classificação: o gasto recorrente não se reclassifica todo mês</w:t>
             </w:r>
           </w:p>
         </w:tc>
@@ -5544,7 +5544,7 @@
                 <w:sz w:val="20"/>
                 <w:szCs w:val="20"/>
               </w:rPr>
-              <w:t xml:space="preserve">A base bancária é assunto exclusivo da chefia — decorrência direta de ela misturar gasto de negócio e gasto pessoal. O que dela deriva e não a expõe — custo, margem, preço, indicador — segue em leitura para a gerência</w:t>
+              <w:t xml:space="preserve">A base bancária é assunto exclusivo da chefia, decorrência direta de ela misturar gasto de negócio e gasto pessoal. O que dela deriva e não a expõe (custo, margem, preço, indicador) segue em leitura para a gerência</w:t>
             </w:r>
           </w:p>
         </w:tc>
@@ -5617,7 +5617,7 @@
                 <w:sz w:val="20"/>
                 <w:szCs w:val="20"/>
               </w:rPr>
-              <w:t xml:space="preserve">Transferência entre contas do próprio viveiro não é despesa nem receita — sem pareá-las, o mesmo dinheiro conta duas vezes</w:t>
+              <w:t xml:space="preserve">Transferência entre contas do próprio viveiro não é despesa nem receita: sem pareá-las, o mesmo dinheiro conta duas vezes</w:t>
             </w:r>
           </w:p>
         </w:tc>
@@ -5961,7 +5961,7 @@
                 <w:sz w:val="20"/>
                 <w:szCs w:val="20"/>
               </w:rPr>
-              <w:t xml:space="preserve">Cada pessoa tem um perfil — chefia, gerência, colaborador, administrador — que determina o que ela vê e o que pode fazer</w:t>
+              <w:t xml:space="preserve">Cada pessoa tem um perfil (chefia, gerência, colaborador, administrador) que determina o que ela vê e o que pode fazer</w:t>
             </w:r>
           </w:p>
         </w:tc>
@@ -10197,7 +10197,7 @@
                 <w:sz w:val="20"/>
                 <w:szCs w:val="20"/>
               </w:rPr>
-              <w:t xml:space="preserve">O sistema deve permitir registrar atividade de produção — semeadura, repicagem, irrigação, adubação — com espécie, recipiente e quantidade</w:t>
+              <w:t xml:space="preserve">O sistema deve permitir registrar atividade de produção (semeadura, repicagem, irrigação, adubação) com espécie, recipiente e quantidade</w:t>
             </w:r>
           </w:p>
         </w:tc>
@@ -16260,7 +16260,7 @@
                 <w:sz w:val="20"/>
                 <w:szCs w:val="20"/>
               </w:rPr>
-              <w:t xml:space="preserve">O sistema deve restringir a base bancária — extratos, lançamentos, compras, custos fixos e fechamento — aos perfis chefia e administrador</w:t>
+              <w:t xml:space="preserve">O sistema deve restringir a base bancária (extratos, lançamentos, compras, custos fixos e fechamento) aos perfis chefia e administrador</w:t>
             </w:r>
           </w:p>
         </w:tc>
@@ -16824,7 +16824,7 @@
                 <w:sz w:val="20"/>
                 <w:szCs w:val="20"/>
               </w:rPr>
-              <w:t xml:space="preserve">O sistema deve permitir registrar item genérico — quantidade e recipiente sem espécie definida —, atendido posteriormente por uma ou mais espécies</w:t>
+              <w:t xml:space="preserve">O sistema deve permitir registrar item genérico (quantidade e recipiente sem espécie definida), atendido posteriormente por uma ou mais espécies</w:t>
             </w:r>
           </w:p>
         </w:tc>
@@ -17247,7 +17247,7 @@
                 <w:sz w:val="20"/>
                 <w:szCs w:val="20"/>
               </w:rPr>
-              <w:t xml:space="preserve">O sistema deve permitir cadastrar funcionário com contato e vínculo — fixo ou diarista —, inclusive quando ele não tem acesso ao sistema</w:t>
+              <w:t xml:space="preserve">O sistema deve permitir cadastrar funcionário com contato e vínculo (fixo ou diarista), inclusive quando ele não tem acesso ao sistema</w:t>
             </w:r>
           </w:p>
         </w:tc>
@@ -17529,7 +17529,7 @@
                 <w:sz w:val="20"/>
                 <w:szCs w:val="20"/>
               </w:rPr>
-              <w:t xml:space="preserve">O sistema deve permitir montar a agenda da semana atribuindo, por funcionário e por dia, o tipo de tarefa e o turno — manhã ou tarde</w:t>
+              <w:t xml:space="preserve">O sistema deve permitir montar a agenda da semana atribuindo, por funcionário e por dia, o tipo de tarefa e o turno, manhã ou tarde</w:t>
             </w:r>
           </w:p>
         </w:tc>
@@ -17811,7 +17811,7 @@
                 <w:sz w:val="20"/>
                 <w:szCs w:val="20"/>
               </w:rPr>
-              <w:t xml:space="preserve">O sistema deve controlar a situação da semana — rascunho, publicada e fechada — e impedir alteração depois do fechamento</w:t>
+              <w:t xml:space="preserve">O sistema deve controlar a situação da semana (rascunho, publicada e fechada) e impedir alteração depois do fechamento</w:t>
             </w:r>
           </w:p>
         </w:tc>

</xml_diff>

<commit_message>
auto(claude): commit automatico na branch docs/quadros-regras-e-requisitos
Branch: docs/quadros-regras-e-requisitos
Data: 2026-08-24 11:47:47
Arquivos alterados (2):
plans/P13-producao-agenda-cadastros.md
quadros-regras-de-negocio-e-requisitos.docx

[commit automatico gerado pelo Claude Code]
</commit_message>
<xml_diff>
--- a/quadros-regras-de-negocio-e-requisitos.docx
+++ b/quadros-regras-de-negocio-e-requisitos.docx
@@ -4743,7 +4743,7 @@
                 <w:szCs w:val="20"/>
                 <w:highlight w:val="yellow"/>
               </w:rPr>
-              <w:t xml:space="preserve">O centro de custo separa gasto de negócio de gasto pessoal da família, lista fechada de cinco, viveiro, sítio, clínica, casa, floricultura.</w:t>
+              <w:t xml:space="preserve">O centro de custo separa gasto de negócio de gasto pessoal da família. Os cinco iniciais são viveiro, sítio, clínica, casa e floricultura, e o conjunto é mantido no cadastro.</w:t>
             </w:r>
           </w:p>
         </w:tc>
@@ -5182,6 +5182,225 @@
                 <w:szCs w:val="20"/>
               </w:rPr>
               <w:t xml:space="preserve">Pedido entregue não é pedido pago. O recebimento é evento próprio, e só o extrato o comprova.</w:t>
+            </w:r>
+          </w:p>
+        </w:tc>
+      </w:tr>
+      <w:tr>
+        <w:trPr>
+          <w:cantSplit/>
+        </w:trPr>
+        <w:tc>
+          <w:tcPr>
+            <w:tcW w:type="dxa" w:w="1200"/>
+            <w:tcBorders>
+              <w:top w:val="single" w:color="000000" w:sz="4"/>
+              <w:left w:val="single" w:color="000000" w:sz="4"/>
+              <w:bottom w:val="single" w:color="000000" w:sz="4"/>
+              <w:right w:val="single" w:color="000000" w:sz="4"/>
+            </w:tcBorders>
+            <w:tcMar>
+              <w:top w:type="dxa" w:w="60"/>
+              <w:left w:type="dxa" w:w="80"/>
+              <w:bottom w:type="dxa" w:w="60"/>
+              <w:right w:type="dxa" w:w="80"/>
+            </w:tcMar>
+            <w:vAlign w:val="center"/>
+          </w:tcPr>
+          <w:p>
+            <w:pPr>
+              <w:spacing w:after="20" w:before="20" w:line="240"/>
+              <w:jc w:val="center"/>
+            </w:pPr>
+            <w:r>
+              <w:rPr>
+                <w:rFonts w:ascii="Arial" w:cs="Arial" w:eastAsia="Arial" w:hAnsi="Arial"/>
+                <w:b/>
+                <w:bCs/>
+                <w:sz w:val="20"/>
+                <w:szCs w:val="20"/>
+              </w:rPr>
+              <w:t xml:space="preserve">RN-71</w:t>
+            </w:r>
+          </w:p>
+        </w:tc>
+        <w:tc>
+          <w:tcPr>
+            <w:tcW w:type="dxa" w:w="7871"/>
+            <w:tcBorders>
+              <w:top w:val="single" w:color="000000" w:sz="4"/>
+              <w:left w:val="single" w:color="000000" w:sz="4"/>
+              <w:bottom w:val="single" w:color="000000" w:sz="4"/>
+              <w:right w:val="single" w:color="000000" w:sz="4"/>
+            </w:tcBorders>
+            <w:tcMar>
+              <w:top w:type="dxa" w:w="60"/>
+              <w:left w:type="dxa" w:w="80"/>
+              <w:bottom w:type="dxa" w:w="60"/>
+              <w:right w:type="dxa" w:w="80"/>
+            </w:tcMar>
+            <w:vAlign w:val="center"/>
+          </w:tcPr>
+          <w:p>
+            <w:pPr>
+              <w:spacing w:after="20" w:before="20" w:line="240"/>
+              <w:jc w:val="left"/>
+            </w:pPr>
+            <w:r>
+              <w:rPr>
+                <w:rFonts w:ascii="Arial" w:cs="Arial" w:eastAsia="Arial" w:hAnsi="Arial"/>
+                <w:b w:val="false"/>
+                <w:bCs w:val="false"/>
+                <w:sz w:val="20"/>
+                <w:szCs w:val="20"/>
+              </w:rPr>
+              <w:t xml:space="preserve">Os destinos de gasto da família mudam com o tempo. O conjunto de centros de custo é mantido, não fixo.</w:t>
+            </w:r>
+          </w:p>
+        </w:tc>
+      </w:tr>
+      <w:tr>
+        <w:trPr>
+          <w:cantSplit/>
+        </w:trPr>
+        <w:tc>
+          <w:tcPr>
+            <w:tcW w:type="dxa" w:w="1200"/>
+            <w:tcBorders>
+              <w:top w:val="single" w:color="000000" w:sz="4"/>
+              <w:left w:val="single" w:color="000000" w:sz="4"/>
+              <w:bottom w:val="single" w:color="000000" w:sz="4"/>
+              <w:right w:val="single" w:color="000000" w:sz="4"/>
+            </w:tcBorders>
+            <w:tcMar>
+              <w:top w:type="dxa" w:w="60"/>
+              <w:left w:type="dxa" w:w="80"/>
+              <w:bottom w:type="dxa" w:w="60"/>
+              <w:right w:type="dxa" w:w="80"/>
+            </w:tcMar>
+            <w:vAlign w:val="center"/>
+          </w:tcPr>
+          <w:p>
+            <w:pPr>
+              <w:spacing w:after="20" w:before="20" w:line="240"/>
+              <w:jc w:val="center"/>
+            </w:pPr>
+            <w:r>
+              <w:rPr>
+                <w:rFonts w:ascii="Arial" w:cs="Arial" w:eastAsia="Arial" w:hAnsi="Arial"/>
+                <w:b/>
+                <w:bCs/>
+                <w:sz w:val="20"/>
+                <w:szCs w:val="20"/>
+              </w:rPr>
+              <w:t xml:space="preserve">RN-72</w:t>
+            </w:r>
+          </w:p>
+        </w:tc>
+        <w:tc>
+          <w:tcPr>
+            <w:tcW w:type="dxa" w:w="7871"/>
+            <w:tcBorders>
+              <w:top w:val="single" w:color="000000" w:sz="4"/>
+              <w:left w:val="single" w:color="000000" w:sz="4"/>
+              <w:bottom w:val="single" w:color="000000" w:sz="4"/>
+              <w:right w:val="single" w:color="000000" w:sz="4"/>
+            </w:tcBorders>
+            <w:tcMar>
+              <w:top w:type="dxa" w:w="60"/>
+              <w:left w:type="dxa" w:w="80"/>
+              <w:bottom w:type="dxa" w:w="60"/>
+              <w:right w:type="dxa" w:w="80"/>
+            </w:tcMar>
+            <w:vAlign w:val="center"/>
+          </w:tcPr>
+          <w:p>
+            <w:pPr>
+              <w:spacing w:after="20" w:before="20" w:line="240"/>
+              <w:jc w:val="left"/>
+            </w:pPr>
+            <w:r>
+              <w:rPr>
+                <w:rFonts w:ascii="Arial" w:cs="Arial" w:eastAsia="Arial" w:hAnsi="Arial"/>
+                <w:b w:val="false"/>
+                <w:bCs w:val="false"/>
+                <w:sz w:val="20"/>
+                <w:szCs w:val="20"/>
+              </w:rPr>
+              <w:t xml:space="preserve">Centro de custo não se exclui, inativa-se. O lançamento já classificado guarda o seu centro para sempre.</w:t>
+            </w:r>
+          </w:p>
+        </w:tc>
+      </w:tr>
+      <w:tr>
+        <w:trPr>
+          <w:cantSplit/>
+        </w:trPr>
+        <w:tc>
+          <w:tcPr>
+            <w:tcW w:type="dxa" w:w="1200"/>
+            <w:tcBorders>
+              <w:top w:val="single" w:color="000000" w:sz="4"/>
+              <w:left w:val="single" w:color="000000" w:sz="4"/>
+              <w:bottom w:val="single" w:color="000000" w:sz="4"/>
+              <w:right w:val="single" w:color="000000" w:sz="4"/>
+            </w:tcBorders>
+            <w:tcMar>
+              <w:top w:type="dxa" w:w="60"/>
+              <w:left w:type="dxa" w:w="80"/>
+              <w:bottom w:type="dxa" w:w="60"/>
+              <w:right w:type="dxa" w:w="80"/>
+            </w:tcMar>
+            <w:vAlign w:val="center"/>
+          </w:tcPr>
+          <w:p>
+            <w:pPr>
+              <w:spacing w:after="20" w:before="20" w:line="240"/>
+              <w:jc w:val="center"/>
+            </w:pPr>
+            <w:r>
+              <w:rPr>
+                <w:rFonts w:ascii="Arial" w:cs="Arial" w:eastAsia="Arial" w:hAnsi="Arial"/>
+                <w:b/>
+                <w:bCs/>
+                <w:sz w:val="20"/>
+                <w:szCs w:val="20"/>
+              </w:rPr>
+              <w:t xml:space="preserve">RN-73</w:t>
+            </w:r>
+          </w:p>
+        </w:tc>
+        <w:tc>
+          <w:tcPr>
+            <w:tcW w:type="dxa" w:w="7871"/>
+            <w:tcBorders>
+              <w:top w:val="single" w:color="000000" w:sz="4"/>
+              <w:left w:val="single" w:color="000000" w:sz="4"/>
+              <w:bottom w:val="single" w:color="000000" w:sz="4"/>
+              <w:right w:val="single" w:color="000000" w:sz="4"/>
+            </w:tcBorders>
+            <w:tcMar>
+              <w:top w:type="dxa" w:w="60"/>
+              <w:left w:type="dxa" w:w="80"/>
+              <w:bottom w:type="dxa" w:w="60"/>
+              <w:right w:type="dxa" w:w="80"/>
+            </w:tcMar>
+            <w:vAlign w:val="center"/>
+          </w:tcPr>
+          <w:p>
+            <w:pPr>
+              <w:spacing w:after="20" w:before="20" w:line="240"/>
+              <w:jc w:val="left"/>
+            </w:pPr>
+            <w:r>
+              <w:rPr>
+                <w:rFonts w:ascii="Arial" w:cs="Arial" w:eastAsia="Arial" w:hAnsi="Arial"/>
+                <w:b w:val="false"/>
+                <w:bCs w:val="false"/>
+                <w:sz w:val="20"/>
+                <w:szCs w:val="20"/>
+              </w:rPr>
+              <w:t xml:space="preserve">A natureza do centro é escolhida uma vez. Alterá-la depois de existir lançamento reescreveria o passado.</w:t>
             </w:r>
           </w:p>
         </w:tc>
@@ -6401,7 +6620,7 @@
                 <w:sz w:val="20"/>
                 <w:szCs w:val="20"/>
               </w:rPr>
-              <w:t xml:space="preserve">RN-40 a RN-44, RN-68 a RN-70</w:t>
+              <w:t xml:space="preserve">RN-40 a RN-44, RN-68 a RN-73</w:t>
             </w:r>
           </w:p>
         </w:tc>
@@ -6435,7 +6654,7 @@
                 <w:sz w:val="20"/>
                 <w:szCs w:val="20"/>
               </w:rPr>
-              <w:t xml:space="preserve">8</w:t>
+              <w:t xml:space="preserve">11</w:t>
             </w:r>
           </w:p>
         </w:tc>
@@ -6756,7 +6975,7 @@
                 <w:sz w:val="20"/>
                 <w:szCs w:val="20"/>
               </w:rPr>
-              <w:t xml:space="preserve">62</w:t>
+              <w:t xml:space="preserve">65</w:t>
             </w:r>
           </w:p>
         </w:tc>
@@ -14973,7 +15192,7 @@
                 <w:sz w:val="20"/>
                 <w:szCs w:val="20"/>
               </w:rPr>
-              <w:t xml:space="preserve">O sistema deve permitir classificar cada lançamento indicando centro de custo, categoria e contraparte, todos em lista fechada.</w:t>
+              <w:t xml:space="preserve">O sistema deve permitir classificar cada lançamento indicando centro de custo, categoria e contraparte, todos escolhidos de lista mantida no cadastro, sem digitação livre.</w:t>
             </w:r>
           </w:p>
         </w:tc>
@@ -17687,6 +17906,429 @@
                 <w:szCs w:val="20"/>
               </w:rPr>
               <w:t xml:space="preserve">RN-48, RN-53, RN-56</w:t>
+            </w:r>
+          </w:p>
+        </w:tc>
+      </w:tr>
+      <w:tr>
+        <w:trPr>
+          <w:cantSplit/>
+        </w:trPr>
+        <w:tc>
+          <w:tcPr>
+            <w:tcW w:type="dxa" w:w="900"/>
+            <w:tcBorders>
+              <w:top w:val="single" w:color="000000" w:sz="4"/>
+              <w:left w:val="single" w:color="000000" w:sz="4"/>
+              <w:bottom w:val="single" w:color="000000" w:sz="4"/>
+              <w:right w:val="single" w:color="000000" w:sz="4"/>
+            </w:tcBorders>
+            <w:tcMar>
+              <w:top w:type="dxa" w:w="60"/>
+              <w:left w:type="dxa" w:w="80"/>
+              <w:bottom w:type="dxa" w:w="60"/>
+              <w:right w:type="dxa" w:w="80"/>
+            </w:tcMar>
+            <w:vAlign w:val="center"/>
+          </w:tcPr>
+          <w:p>
+            <w:pPr>
+              <w:spacing w:after="20" w:before="20" w:line="240"/>
+              <w:jc w:val="center"/>
+            </w:pPr>
+            <w:r>
+              <w:rPr>
+                <w:rFonts w:ascii="Arial" w:cs="Arial" w:eastAsia="Arial" w:hAnsi="Arial"/>
+                <w:b/>
+                <w:bCs/>
+                <w:sz w:val="20"/>
+                <w:szCs w:val="20"/>
+              </w:rPr>
+              <w:t xml:space="preserve">RF-77</w:t>
+            </w:r>
+          </w:p>
+        </w:tc>
+        <w:tc>
+          <w:tcPr>
+            <w:tcW w:type="dxa" w:w="2100"/>
+            <w:tcBorders>
+              <w:top w:val="single" w:color="000000" w:sz="4"/>
+              <w:left w:val="single" w:color="000000" w:sz="4"/>
+              <w:bottom w:val="single" w:color="000000" w:sz="4"/>
+              <w:right w:val="single" w:color="000000" w:sz="4"/>
+            </w:tcBorders>
+            <w:tcMar>
+              <w:top w:type="dxa" w:w="60"/>
+              <w:left w:type="dxa" w:w="80"/>
+              <w:bottom w:type="dxa" w:w="60"/>
+              <w:right w:type="dxa" w:w="80"/>
+            </w:tcMar>
+            <w:vAlign w:val="center"/>
+          </w:tcPr>
+          <w:p>
+            <w:pPr>
+              <w:spacing w:after="20" w:before="20" w:line="240"/>
+              <w:jc w:val="left"/>
+            </w:pPr>
+            <w:r>
+              <w:rPr>
+                <w:rFonts w:ascii="Arial" w:cs="Arial" w:eastAsia="Arial" w:hAnsi="Arial"/>
+                <w:b w:val="false"/>
+                <w:bCs w:val="false"/>
+                <w:sz w:val="20"/>
+                <w:szCs w:val="20"/>
+              </w:rPr>
+              <w:t xml:space="preserve">Cadastro de centro de custo</w:t>
+            </w:r>
+          </w:p>
+        </w:tc>
+        <w:tc>
+          <w:tcPr>
+            <w:tcW w:type="dxa" w:w="4571"/>
+            <w:tcBorders>
+              <w:top w:val="single" w:color="000000" w:sz="4"/>
+              <w:left w:val="single" w:color="000000" w:sz="4"/>
+              <w:bottom w:val="single" w:color="000000" w:sz="4"/>
+              <w:right w:val="single" w:color="000000" w:sz="4"/>
+            </w:tcBorders>
+            <w:tcMar>
+              <w:top w:type="dxa" w:w="60"/>
+              <w:left w:type="dxa" w:w="80"/>
+              <w:bottom w:type="dxa" w:w="60"/>
+              <w:right w:type="dxa" w:w="80"/>
+            </w:tcMar>
+            <w:vAlign w:val="center"/>
+          </w:tcPr>
+          <w:p>
+            <w:pPr>
+              <w:spacing w:after="20" w:before="20" w:line="240"/>
+              <w:jc w:val="left"/>
+            </w:pPr>
+            <w:r>
+              <w:rPr>
+                <w:rFonts w:ascii="Arial" w:cs="Arial" w:eastAsia="Arial" w:hAnsi="Arial"/>
+                <w:b w:val="false"/>
+                <w:bCs w:val="false"/>
+                <w:sz w:val="20"/>
+                <w:szCs w:val="20"/>
+              </w:rPr>
+              <w:t xml:space="preserve">O sistema deve permitir cadastrar centro de custo informando nome e natureza (negócio ou pessoal).</w:t>
+            </w:r>
+          </w:p>
+        </w:tc>
+        <w:tc>
+          <w:tcPr>
+            <w:tcW w:type="dxa" w:w="1500"/>
+            <w:tcBorders>
+              <w:top w:val="single" w:color="000000" w:sz="4"/>
+              <w:left w:val="single" w:color="000000" w:sz="4"/>
+              <w:bottom w:val="single" w:color="000000" w:sz="4"/>
+              <w:right w:val="single" w:color="000000" w:sz="4"/>
+            </w:tcBorders>
+            <w:tcMar>
+              <w:top w:type="dxa" w:w="60"/>
+              <w:left w:type="dxa" w:w="80"/>
+              <w:bottom w:type="dxa" w:w="60"/>
+              <w:right w:type="dxa" w:w="80"/>
+            </w:tcMar>
+            <w:vAlign w:val="center"/>
+          </w:tcPr>
+          <w:p>
+            <w:pPr>
+              <w:spacing w:after="20" w:before="20" w:line="240"/>
+              <w:jc w:val="left"/>
+            </w:pPr>
+            <w:r>
+              <w:rPr>
+                <w:rFonts w:ascii="Arial" w:cs="Arial" w:eastAsia="Arial" w:hAnsi="Arial"/>
+                <w:b w:val="false"/>
+                <w:bCs w:val="false"/>
+                <w:sz w:val="20"/>
+                <w:szCs w:val="20"/>
+              </w:rPr>
+              <w:t xml:space="preserve">RN-71</w:t>
+            </w:r>
+          </w:p>
+        </w:tc>
+      </w:tr>
+      <w:tr>
+        <w:trPr>
+          <w:cantSplit/>
+        </w:trPr>
+        <w:tc>
+          <w:tcPr>
+            <w:tcW w:type="dxa" w:w="900"/>
+            <w:tcBorders>
+              <w:top w:val="single" w:color="000000" w:sz="4"/>
+              <w:left w:val="single" w:color="000000" w:sz="4"/>
+              <w:bottom w:val="single" w:color="000000" w:sz="4"/>
+              <w:right w:val="single" w:color="000000" w:sz="4"/>
+            </w:tcBorders>
+            <w:tcMar>
+              <w:top w:type="dxa" w:w="60"/>
+              <w:left w:type="dxa" w:w="80"/>
+              <w:bottom w:type="dxa" w:w="60"/>
+              <w:right w:type="dxa" w:w="80"/>
+            </w:tcMar>
+            <w:vAlign w:val="center"/>
+          </w:tcPr>
+          <w:p>
+            <w:pPr>
+              <w:spacing w:after="20" w:before="20" w:line="240"/>
+              <w:jc w:val="center"/>
+            </w:pPr>
+            <w:r>
+              <w:rPr>
+                <w:rFonts w:ascii="Arial" w:cs="Arial" w:eastAsia="Arial" w:hAnsi="Arial"/>
+                <w:b/>
+                <w:bCs/>
+                <w:sz w:val="20"/>
+                <w:szCs w:val="20"/>
+              </w:rPr>
+              <w:t xml:space="preserve">RF-78</w:t>
+            </w:r>
+          </w:p>
+        </w:tc>
+        <w:tc>
+          <w:tcPr>
+            <w:tcW w:type="dxa" w:w="2100"/>
+            <w:tcBorders>
+              <w:top w:val="single" w:color="000000" w:sz="4"/>
+              <w:left w:val="single" w:color="000000" w:sz="4"/>
+              <w:bottom w:val="single" w:color="000000" w:sz="4"/>
+              <w:right w:val="single" w:color="000000" w:sz="4"/>
+            </w:tcBorders>
+            <w:tcMar>
+              <w:top w:type="dxa" w:w="60"/>
+              <w:left w:type="dxa" w:w="80"/>
+              <w:bottom w:type="dxa" w:w="60"/>
+              <w:right w:type="dxa" w:w="80"/>
+            </w:tcMar>
+            <w:vAlign w:val="center"/>
+          </w:tcPr>
+          <w:p>
+            <w:pPr>
+              <w:spacing w:after="20" w:before="20" w:line="240"/>
+              <w:jc w:val="left"/>
+            </w:pPr>
+            <w:r>
+              <w:rPr>
+                <w:rFonts w:ascii="Arial" w:cs="Arial" w:eastAsia="Arial" w:hAnsi="Arial"/>
+                <w:b w:val="false"/>
+                <w:bCs w:val="false"/>
+                <w:sz w:val="20"/>
+                <w:szCs w:val="20"/>
+              </w:rPr>
+              <w:t xml:space="preserve">Inativação de centro de custo</w:t>
+            </w:r>
+          </w:p>
+        </w:tc>
+        <w:tc>
+          <w:tcPr>
+            <w:tcW w:type="dxa" w:w="4571"/>
+            <w:tcBorders>
+              <w:top w:val="single" w:color="000000" w:sz="4"/>
+              <w:left w:val="single" w:color="000000" w:sz="4"/>
+              <w:bottom w:val="single" w:color="000000" w:sz="4"/>
+              <w:right w:val="single" w:color="000000" w:sz="4"/>
+            </w:tcBorders>
+            <w:tcMar>
+              <w:top w:type="dxa" w:w="60"/>
+              <w:left w:type="dxa" w:w="80"/>
+              <w:bottom w:type="dxa" w:w="60"/>
+              <w:right w:type="dxa" w:w="80"/>
+            </w:tcMar>
+            <w:vAlign w:val="center"/>
+          </w:tcPr>
+          <w:p>
+            <w:pPr>
+              <w:spacing w:after="20" w:before="20" w:line="240"/>
+              <w:jc w:val="left"/>
+            </w:pPr>
+            <w:r>
+              <w:rPr>
+                <w:rFonts w:ascii="Arial" w:cs="Arial" w:eastAsia="Arial" w:hAnsi="Arial"/>
+                <w:b w:val="false"/>
+                <w:bCs w:val="false"/>
+                <w:sz w:val="20"/>
+                <w:szCs w:val="20"/>
+              </w:rPr>
+              <w:t xml:space="preserve">O sistema deve permitir inativar e reativar centro de custo, retirando-o das escolhas de lançamento novo sem afetar lançamento já classificado nele.</w:t>
+            </w:r>
+          </w:p>
+        </w:tc>
+        <w:tc>
+          <w:tcPr>
+            <w:tcW w:type="dxa" w:w="1500"/>
+            <w:tcBorders>
+              <w:top w:val="single" w:color="000000" w:sz="4"/>
+              <w:left w:val="single" w:color="000000" w:sz="4"/>
+              <w:bottom w:val="single" w:color="000000" w:sz="4"/>
+              <w:right w:val="single" w:color="000000" w:sz="4"/>
+            </w:tcBorders>
+            <w:tcMar>
+              <w:top w:type="dxa" w:w="60"/>
+              <w:left w:type="dxa" w:w="80"/>
+              <w:bottom w:type="dxa" w:w="60"/>
+              <w:right w:type="dxa" w:w="80"/>
+            </w:tcMar>
+            <w:vAlign w:val="center"/>
+          </w:tcPr>
+          <w:p>
+            <w:pPr>
+              <w:spacing w:after="20" w:before="20" w:line="240"/>
+              <w:jc w:val="left"/>
+            </w:pPr>
+            <w:r>
+              <w:rPr>
+                <w:rFonts w:ascii="Arial" w:cs="Arial" w:eastAsia="Arial" w:hAnsi="Arial"/>
+                <w:b w:val="false"/>
+                <w:bCs w:val="false"/>
+                <w:sz w:val="20"/>
+                <w:szCs w:val="20"/>
+              </w:rPr>
+              <w:t xml:space="preserve">RN-72</w:t>
+            </w:r>
+          </w:p>
+        </w:tc>
+      </w:tr>
+      <w:tr>
+        <w:trPr>
+          <w:cantSplit/>
+        </w:trPr>
+        <w:tc>
+          <w:tcPr>
+            <w:tcW w:type="dxa" w:w="900"/>
+            <w:tcBorders>
+              <w:top w:val="single" w:color="000000" w:sz="4"/>
+              <w:left w:val="single" w:color="000000" w:sz="4"/>
+              <w:bottom w:val="single" w:color="000000" w:sz="4"/>
+              <w:right w:val="single" w:color="000000" w:sz="4"/>
+            </w:tcBorders>
+            <w:tcMar>
+              <w:top w:type="dxa" w:w="60"/>
+              <w:left w:type="dxa" w:w="80"/>
+              <w:bottom w:type="dxa" w:w="60"/>
+              <w:right w:type="dxa" w:w="80"/>
+            </w:tcMar>
+            <w:vAlign w:val="center"/>
+          </w:tcPr>
+          <w:p>
+            <w:pPr>
+              <w:spacing w:after="20" w:before="20" w:line="240"/>
+              <w:jc w:val="center"/>
+            </w:pPr>
+            <w:r>
+              <w:rPr>
+                <w:rFonts w:ascii="Arial" w:cs="Arial" w:eastAsia="Arial" w:hAnsi="Arial"/>
+                <w:b/>
+                <w:bCs/>
+                <w:sz w:val="20"/>
+                <w:szCs w:val="20"/>
+              </w:rPr>
+              <w:t xml:space="preserve">RF-79</w:t>
+            </w:r>
+          </w:p>
+        </w:tc>
+        <w:tc>
+          <w:tcPr>
+            <w:tcW w:type="dxa" w:w="2100"/>
+            <w:tcBorders>
+              <w:top w:val="single" w:color="000000" w:sz="4"/>
+              <w:left w:val="single" w:color="000000" w:sz="4"/>
+              <w:bottom w:val="single" w:color="000000" w:sz="4"/>
+              <w:right w:val="single" w:color="000000" w:sz="4"/>
+            </w:tcBorders>
+            <w:tcMar>
+              <w:top w:type="dxa" w:w="60"/>
+              <w:left w:type="dxa" w:w="80"/>
+              <w:bottom w:type="dxa" w:w="60"/>
+              <w:right w:type="dxa" w:w="80"/>
+            </w:tcMar>
+            <w:vAlign w:val="center"/>
+          </w:tcPr>
+          <w:p>
+            <w:pPr>
+              <w:spacing w:after="20" w:before="20" w:line="240"/>
+              <w:jc w:val="left"/>
+            </w:pPr>
+            <w:r>
+              <w:rPr>
+                <w:rFonts w:ascii="Arial" w:cs="Arial" w:eastAsia="Arial" w:hAnsi="Arial"/>
+                <w:b w:val="false"/>
+                <w:bCs w:val="false"/>
+                <w:sz w:val="20"/>
+                <w:szCs w:val="20"/>
+              </w:rPr>
+              <w:t xml:space="preserve">Imutabilidade da natureza do centro</w:t>
+            </w:r>
+          </w:p>
+        </w:tc>
+        <w:tc>
+          <w:tcPr>
+            <w:tcW w:type="dxa" w:w="4571"/>
+            <w:tcBorders>
+              <w:top w:val="single" w:color="000000" w:sz="4"/>
+              <w:left w:val="single" w:color="000000" w:sz="4"/>
+              <w:bottom w:val="single" w:color="000000" w:sz="4"/>
+              <w:right w:val="single" w:color="000000" w:sz="4"/>
+            </w:tcBorders>
+            <w:tcMar>
+              <w:top w:type="dxa" w:w="60"/>
+              <w:left w:type="dxa" w:w="80"/>
+              <w:bottom w:type="dxa" w:w="60"/>
+              <w:right w:type="dxa" w:w="80"/>
+            </w:tcMar>
+            <w:vAlign w:val="center"/>
+          </w:tcPr>
+          <w:p>
+            <w:pPr>
+              <w:spacing w:after="20" w:before="20" w:line="240"/>
+              <w:jc w:val="left"/>
+            </w:pPr>
+            <w:r>
+              <w:rPr>
+                <w:rFonts w:ascii="Arial" w:cs="Arial" w:eastAsia="Arial" w:hAnsi="Arial"/>
+                <w:b w:val="false"/>
+                <w:bCs w:val="false"/>
+                <w:sz w:val="20"/>
+                <w:szCs w:val="20"/>
+              </w:rPr>
+              <w:t xml:space="preserve">O sistema não deve permitir excluir centro de custo, nem alterar a sua natureza depois de existir lançamento classificado nele.</w:t>
+            </w:r>
+          </w:p>
+        </w:tc>
+        <w:tc>
+          <w:tcPr>
+            <w:tcW w:type="dxa" w:w="1500"/>
+            <w:tcBorders>
+              <w:top w:val="single" w:color="000000" w:sz="4"/>
+              <w:left w:val="single" w:color="000000" w:sz="4"/>
+              <w:bottom w:val="single" w:color="000000" w:sz="4"/>
+              <w:right w:val="single" w:color="000000" w:sz="4"/>
+            </w:tcBorders>
+            <w:tcMar>
+              <w:top w:type="dxa" w:w="60"/>
+              <w:left w:type="dxa" w:w="80"/>
+              <w:bottom w:type="dxa" w:w="60"/>
+              <w:right w:type="dxa" w:w="80"/>
+            </w:tcMar>
+            <w:vAlign w:val="center"/>
+          </w:tcPr>
+          <w:p>
+            <w:pPr>
+              <w:spacing w:after="20" w:before="20" w:line="240"/>
+              <w:jc w:val="left"/>
+            </w:pPr>
+            <w:r>
+              <w:rPr>
+                <w:rFonts w:ascii="Arial" w:cs="Arial" w:eastAsia="Arial" w:hAnsi="Arial"/>
+                <w:b w:val="false"/>
+                <w:bCs w:val="false"/>
+                <w:sz w:val="20"/>
+                <w:szCs w:val="20"/>
+              </w:rPr>
+              <w:t xml:space="preserve">RN-73</w:t>
             </w:r>
           </w:p>
         </w:tc>
@@ -23295,7 +23937,7 @@
                 <w:sz w:val="20"/>
                 <w:szCs w:val="20"/>
               </w:rPr>
-              <w:t xml:space="preserve">72</w:t>
+              <w:t xml:space="preserve">75</w:t>
             </w:r>
           </w:p>
         </w:tc>
@@ -23329,7 +23971,7 @@
                 <w:sz w:val="20"/>
                 <w:szCs w:val="20"/>
               </w:rPr>
-              <w:t xml:space="preserve">94,7</w:t>
+              <w:t xml:space="preserve">94,9</w:t>
             </w:r>
           </w:p>
         </w:tc>
@@ -23679,7 +24321,7 @@
                 <w:sz w:val="20"/>
                 <w:szCs w:val="20"/>
               </w:rPr>
-              <w:t xml:space="preserve">5,3</w:t>
+              <w:t xml:space="preserve">5,1</w:t>
             </w:r>
           </w:p>
         </w:tc>
@@ -23820,7 +24462,7 @@
                 <w:sz w:val="20"/>
                 <w:szCs w:val="20"/>
               </w:rPr>
-              <w:t xml:space="preserve">76</w:t>
+              <w:t xml:space="preserve">79</w:t>
             </w:r>
           </w:p>
         </w:tc>

</xml_diff>